<commit_message>
Mai làm 3B trên cty
</commit_message>
<xml_diff>
--- a/HomeWork/Knowledge_Python.docx
+++ b/HomeWork/Knowledge_Python.docx
@@ -1263,6 +1263,87 @@
     </w:p>
     <w:p>
       <w:pPr>
+        <w:numPr>
+          <w:ilvl w:val="0"/>
+          <w:numId w:val="3"/>
+        </w:numPr>
+        <w:ind w:left="0" w:leftChars="0" w:firstLine="0" w:firstLineChars="0"/>
+        <w:rPr>
+          <w:rFonts w:hint="default"/>
+          <w:b/>
+          <w:bCs/>
+          <w:lang w:val="en-US"/>
+        </w:rPr>
+      </w:pPr>
+      <w:r>
+        <w:rPr>
+          <w:rFonts w:hint="default"/>
+          <w:b/>
+          <w:bCs/>
+          <w:lang w:val="en-US"/>
+        </w:rPr>
+        <w:t xml:space="preserve">Vẽ biểu đồ count values của item trong cột: </w:t>
+      </w:r>
+    </w:p>
+    <w:p>
+      <w:pPr>
+        <w:numPr>
+          <w:numId w:val="0"/>
+        </w:numPr>
+        <w:ind w:leftChars="0"/>
+        <w:rPr>
+          <w:rFonts w:hint="default"/>
+          <w:b/>
+          <w:bCs/>
+          <w:lang w:val="en-US"/>
+        </w:rPr>
+      </w:pPr>
+      <w:r>
+        <w:drawing>
+          <wp:inline distT="0" distB="0" distL="114300" distR="114300">
+            <wp:extent cx="4695825" cy="1428750"/>
+            <wp:effectExtent l="0" t="0" r="9525" b="0"/>
+            <wp:docPr id="29" name="Picture 29"/>
+            <wp:cNvGraphicFramePr>
+              <a:graphicFrameLocks xmlns:a="http://schemas.openxmlformats.org/drawingml/2006/main" noChangeAspect="1"/>
+            </wp:cNvGraphicFramePr>
+            <a:graphic xmlns:a="http://schemas.openxmlformats.org/drawingml/2006/main">
+              <a:graphicData uri="http://schemas.openxmlformats.org/drawingml/2006/picture">
+                <pic:pic xmlns:pic="http://schemas.openxmlformats.org/drawingml/2006/picture">
+                  <pic:nvPicPr>
+                    <pic:cNvPr id="29" name="Picture 29"/>
+                    <pic:cNvPicPr>
+                      <a:picLocks noChangeAspect="1"/>
+                    </pic:cNvPicPr>
+                  </pic:nvPicPr>
+                  <pic:blipFill>
+                    <a:blip r:embed="rId20"/>
+                    <a:stretch>
+                      <a:fillRect/>
+                    </a:stretch>
+                  </pic:blipFill>
+                  <pic:spPr>
+                    <a:xfrm>
+                      <a:off x="0" y="0"/>
+                      <a:ext cx="4695825" cy="1428750"/>
+                    </a:xfrm>
+                    <a:prstGeom prst="rect">
+                      <a:avLst/>
+                    </a:prstGeom>
+                    <a:noFill/>
+                    <a:ln>
+                      <a:noFill/>
+                    </a:ln>
+                  </pic:spPr>
+                </pic:pic>
+              </a:graphicData>
+            </a:graphic>
+          </wp:inline>
+        </w:drawing>
+      </w:r>
+    </w:p>
+    <w:p>
+      <w:pPr>
         <w:pStyle w:val="2"/>
         <w:bidi w:val="0"/>
         <w:rPr>
@@ -1338,7 +1419,7 @@
                     </pic:cNvPicPr>
                   </pic:nvPicPr>
                   <pic:blipFill>
-                    <a:blip r:embed="rId20"/>
+                    <a:blip r:embed="rId21"/>
                     <a:stretch>
                       <a:fillRect/>
                     </a:stretch>
@@ -1409,6 +1490,7 @@
           <w:lang w:val="en-US"/>
         </w:rPr>
       </w:pPr>
+      <w:bookmarkStart w:id="0" w:name="_GoBack"/>
       <w:r>
         <w:drawing>
           <wp:inline distT="0" distB="0" distL="114300" distR="114300">
@@ -1428,7 +1510,7 @@
                     </pic:cNvPicPr>
                   </pic:nvPicPr>
                   <pic:blipFill>
-                    <a:blip r:embed="rId21"/>
+                    <a:blip r:embed="rId22"/>
                     <a:stretch>
                       <a:fillRect/>
                     </a:stretch>
@@ -1452,7 +1534,6 @@
           </wp:inline>
         </w:drawing>
       </w:r>
-      <w:bookmarkStart w:id="0" w:name="_GoBack"/>
       <w:bookmarkEnd w:id="0"/>
     </w:p>
     <w:sectPr>

</xml_diff>

<commit_message>
Học tiếp4B đanghọc đến Sklearn
</commit_message>
<xml_diff>
--- a/HomeWork/Knowledge_Python.docx
+++ b/HomeWork/Knowledge_Python.docx
@@ -920,10 +920,15 @@
           <w:numId w:val="0"/>
         </w:numPr>
         <w:bidi w:val="0"/>
-        <w:rPr>
-          <w:rFonts w:hint="default"/>
-          <w:lang w:val="en-US"/>
-        </w:rPr>
+      </w:pPr>
+    </w:p>
+    <w:p>
+      <w:pPr>
+        <w:numPr>
+          <w:ilvl w:val="0"/>
+          <w:numId w:val="0"/>
+        </w:numPr>
+        <w:bidi w:val="0"/>
       </w:pPr>
       <w:r>
         <w:drawing>
@@ -971,6 +976,317 @@
     </w:p>
     <w:p>
       <w:pPr>
+        <w:numPr>
+          <w:ilvl w:val="0"/>
+          <w:numId w:val="1"/>
+        </w:numPr>
+        <w:bidi w:val="0"/>
+        <w:ind w:left="0" w:leftChars="0" w:firstLine="0" w:firstLineChars="0"/>
+        <w:rPr>
+          <w:rFonts w:hint="default"/>
+          <w:lang w:val="en-US"/>
+        </w:rPr>
+      </w:pPr>
+      <w:r>
+        <w:rPr>
+          <w:rFonts w:hint="default"/>
+          <w:lang w:val="en-US"/>
+        </w:rPr>
+        <w:t>Vẽ biểu đồ phân tán:</w:t>
+      </w:r>
+    </w:p>
+    <w:p>
+      <w:pPr>
+        <w:numPr>
+          <w:numId w:val="0"/>
+        </w:numPr>
+        <w:bidi w:val="0"/>
+      </w:pPr>
+      <w:r>
+        <w:drawing>
+          <wp:inline distT="0" distB="0" distL="114300" distR="114300">
+            <wp:extent cx="5268595" cy="3340100"/>
+            <wp:effectExtent l="0" t="0" r="8255" b="12700"/>
+            <wp:docPr id="1" name="Picture 1"/>
+            <wp:cNvGraphicFramePr>
+              <a:graphicFrameLocks xmlns:a="http://schemas.openxmlformats.org/drawingml/2006/main" noChangeAspect="1"/>
+            </wp:cNvGraphicFramePr>
+            <a:graphic xmlns:a="http://schemas.openxmlformats.org/drawingml/2006/main">
+              <a:graphicData uri="http://schemas.openxmlformats.org/drawingml/2006/picture">
+                <pic:pic xmlns:pic="http://schemas.openxmlformats.org/drawingml/2006/picture">
+                  <pic:nvPicPr>
+                    <pic:cNvPr id="1" name="Picture 1"/>
+                    <pic:cNvPicPr>
+                      <a:picLocks noChangeAspect="1"/>
+                    </pic:cNvPicPr>
+                  </pic:nvPicPr>
+                  <pic:blipFill>
+                    <a:blip r:embed="rId18"/>
+                    <a:stretch>
+                      <a:fillRect/>
+                    </a:stretch>
+                  </pic:blipFill>
+                  <pic:spPr>
+                    <a:xfrm>
+                      <a:off x="0" y="0"/>
+                      <a:ext cx="5268595" cy="3340100"/>
+                    </a:xfrm>
+                    <a:prstGeom prst="rect">
+                      <a:avLst/>
+                    </a:prstGeom>
+                    <a:noFill/>
+                    <a:ln>
+                      <a:noFill/>
+                    </a:ln>
+                  </pic:spPr>
+                </pic:pic>
+              </a:graphicData>
+            </a:graphic>
+          </wp:inline>
+        </w:drawing>
+      </w:r>
+    </w:p>
+    <w:p>
+      <w:pPr>
+        <w:numPr>
+          <w:ilvl w:val="0"/>
+          <w:numId w:val="1"/>
+        </w:numPr>
+        <w:bidi w:val="0"/>
+        <w:ind w:left="0" w:leftChars="0" w:firstLine="0" w:firstLineChars="0"/>
+        <w:rPr>
+          <w:rFonts w:hint="default"/>
+          <w:lang w:val="en-US"/>
+        </w:rPr>
+      </w:pPr>
+      <w:r>
+        <w:rPr>
+          <w:rFonts w:hint="default"/>
+          <w:lang w:val="en-US"/>
+        </w:rPr>
+        <w:t>Xóa tất cả các giá trị trong hàng nếu value bất kỉ cả nó là NaN:</w:t>
+      </w:r>
+    </w:p>
+    <w:p>
+      <w:pPr>
+        <w:numPr>
+          <w:numId w:val="0"/>
+        </w:numPr>
+        <w:bidi w:val="0"/>
+        <w:ind w:leftChars="0"/>
+      </w:pPr>
+      <w:r>
+        <w:drawing>
+          <wp:inline distT="0" distB="0" distL="114300" distR="114300">
+            <wp:extent cx="5270500" cy="373380"/>
+            <wp:effectExtent l="0" t="0" r="6350" b="7620"/>
+            <wp:docPr id="12" name="Picture 4"/>
+            <wp:cNvGraphicFramePr>
+              <a:graphicFrameLocks xmlns:a="http://schemas.openxmlformats.org/drawingml/2006/main" noChangeAspect="1"/>
+            </wp:cNvGraphicFramePr>
+            <a:graphic xmlns:a="http://schemas.openxmlformats.org/drawingml/2006/main">
+              <a:graphicData uri="http://schemas.openxmlformats.org/drawingml/2006/picture">
+                <pic:pic xmlns:pic="http://schemas.openxmlformats.org/drawingml/2006/picture">
+                  <pic:nvPicPr>
+                    <pic:cNvPr id="12" name="Picture 4"/>
+                    <pic:cNvPicPr>
+                      <a:picLocks noChangeAspect="1"/>
+                    </pic:cNvPicPr>
+                  </pic:nvPicPr>
+                  <pic:blipFill>
+                    <a:blip r:embed="rId19"/>
+                    <a:stretch>
+                      <a:fillRect/>
+                    </a:stretch>
+                  </pic:blipFill>
+                  <pic:spPr>
+                    <a:xfrm>
+                      <a:off x="0" y="0"/>
+                      <a:ext cx="5270500" cy="373380"/>
+                    </a:xfrm>
+                    <a:prstGeom prst="rect">
+                      <a:avLst/>
+                    </a:prstGeom>
+                    <a:noFill/>
+                    <a:ln>
+                      <a:noFill/>
+                    </a:ln>
+                  </pic:spPr>
+                </pic:pic>
+              </a:graphicData>
+            </a:graphic>
+          </wp:inline>
+        </w:drawing>
+      </w:r>
+    </w:p>
+    <w:p>
+      <w:pPr>
+        <w:numPr>
+          <w:ilvl w:val="0"/>
+          <w:numId w:val="1"/>
+        </w:numPr>
+        <w:bidi w:val="0"/>
+        <w:ind w:left="0" w:leftChars="0" w:firstLine="0" w:firstLineChars="0"/>
+        <w:rPr>
+          <w:rFonts w:hint="default"/>
+          <w:lang w:val="en-US"/>
+        </w:rPr>
+      </w:pPr>
+      <w:r>
+        <w:rPr>
+          <w:rFonts w:hint="default"/>
+          <w:lang w:val="en-US"/>
+        </w:rPr>
+        <w:t>Hợp các giá trị trong 1 cột (</w:t>
+      </w:r>
+      <w:r>
+        <w:rPr>
+          <w:rFonts w:ascii="SimSun" w:hAnsi="SimSun" w:eastAsia="SimSun" w:cs="SimSun"/>
+          <w:sz w:val="24"/>
+          <w:szCs w:val="24"/>
+        </w:rPr>
+        <w:t xml:space="preserve">nhóm dữ liệu theo cột </w:t>
+      </w:r>
+      <w:r>
+        <w:rPr>
+          <w:rFonts w:hint="default"/>
+          <w:lang w:val="en-US"/>
+        </w:rPr>
+        <w:t>)</w:t>
+      </w:r>
+    </w:p>
+    <w:p>
+      <w:pPr>
+        <w:numPr>
+          <w:numId w:val="0"/>
+        </w:numPr>
+        <w:bidi w:val="0"/>
+        <w:ind w:leftChars="0"/>
+      </w:pPr>
+      <w:r>
+        <w:drawing>
+          <wp:inline distT="0" distB="0" distL="114300" distR="114300">
+            <wp:extent cx="5267960" cy="4038600"/>
+            <wp:effectExtent l="0" t="0" r="8890" b="0"/>
+            <wp:docPr id="14" name="Picture 5"/>
+            <wp:cNvGraphicFramePr>
+              <a:graphicFrameLocks xmlns:a="http://schemas.openxmlformats.org/drawingml/2006/main" noChangeAspect="1"/>
+            </wp:cNvGraphicFramePr>
+            <a:graphic xmlns:a="http://schemas.openxmlformats.org/drawingml/2006/main">
+              <a:graphicData uri="http://schemas.openxmlformats.org/drawingml/2006/picture">
+                <pic:pic xmlns:pic="http://schemas.openxmlformats.org/drawingml/2006/picture">
+                  <pic:nvPicPr>
+                    <pic:cNvPr id="14" name="Picture 5"/>
+                    <pic:cNvPicPr>
+                      <a:picLocks noChangeAspect="1"/>
+                    </pic:cNvPicPr>
+                  </pic:nvPicPr>
+                  <pic:blipFill>
+                    <a:blip r:embed="rId20"/>
+                    <a:stretch>
+                      <a:fillRect/>
+                    </a:stretch>
+                  </pic:blipFill>
+                  <pic:spPr>
+                    <a:xfrm>
+                      <a:off x="0" y="0"/>
+                      <a:ext cx="5267960" cy="4038600"/>
+                    </a:xfrm>
+                    <a:prstGeom prst="rect">
+                      <a:avLst/>
+                    </a:prstGeom>
+                    <a:noFill/>
+                    <a:ln>
+                      <a:noFill/>
+                    </a:ln>
+                  </pic:spPr>
+                </pic:pic>
+              </a:graphicData>
+            </a:graphic>
+          </wp:inline>
+        </w:drawing>
+      </w:r>
+    </w:p>
+    <w:p>
+      <w:pPr>
+        <w:numPr>
+          <w:ilvl w:val="0"/>
+          <w:numId w:val="1"/>
+        </w:numPr>
+        <w:bidi w:val="0"/>
+        <w:ind w:left="0" w:leftChars="0" w:firstLine="0" w:firstLineChars="0"/>
+        <w:rPr>
+          <w:rFonts w:hint="default"/>
+          <w:lang w:val="en-US"/>
+        </w:rPr>
+      </w:pPr>
+      <w:r>
+        <w:rPr>
+          <w:rFonts w:hint="default"/>
+          <w:lang w:val="en-US"/>
+        </w:rPr>
+        <w:t xml:space="preserve">Sau khi nhóm các dữ liệu có thể  sum các cột khác : </w:t>
+      </w:r>
+    </w:p>
+    <w:p>
+      <w:pPr>
+        <w:numPr>
+          <w:numId w:val="0"/>
+        </w:numPr>
+        <w:bidi w:val="0"/>
+        <w:rPr>
+          <w:rFonts w:hint="default"/>
+          <w:lang w:val="en-US"/>
+        </w:rPr>
+      </w:pPr>
+      <w:r>
+        <w:drawing>
+          <wp:inline distT="0" distB="0" distL="114300" distR="114300">
+            <wp:extent cx="5273040" cy="2133600"/>
+            <wp:effectExtent l="0" t="0" r="3810" b="0"/>
+            <wp:docPr id="17" name="Picture 6"/>
+            <wp:cNvGraphicFramePr>
+              <a:graphicFrameLocks xmlns:a="http://schemas.openxmlformats.org/drawingml/2006/main" noChangeAspect="1"/>
+            </wp:cNvGraphicFramePr>
+            <a:graphic xmlns:a="http://schemas.openxmlformats.org/drawingml/2006/main">
+              <a:graphicData uri="http://schemas.openxmlformats.org/drawingml/2006/picture">
+                <pic:pic xmlns:pic="http://schemas.openxmlformats.org/drawingml/2006/picture">
+                  <pic:nvPicPr>
+                    <pic:cNvPr id="17" name="Picture 6"/>
+                    <pic:cNvPicPr>
+                      <a:picLocks noChangeAspect="1"/>
+                    </pic:cNvPicPr>
+                  </pic:nvPicPr>
+                  <pic:blipFill>
+                    <a:blip r:embed="rId21"/>
+                    <a:stretch>
+                      <a:fillRect/>
+                    </a:stretch>
+                  </pic:blipFill>
+                  <pic:spPr>
+                    <a:xfrm>
+                      <a:off x="0" y="0"/>
+                      <a:ext cx="5273040" cy="2133600"/>
+                    </a:xfrm>
+                    <a:prstGeom prst="rect">
+                      <a:avLst/>
+                    </a:prstGeom>
+                    <a:noFill/>
+                    <a:ln>
+                      <a:noFill/>
+                    </a:ln>
+                  </pic:spPr>
+                </pic:pic>
+              </a:graphicData>
+            </a:graphic>
+          </wp:inline>
+        </w:drawing>
+      </w:r>
+      <w:bookmarkStart w:id="0" w:name="_GoBack"/>
+      <w:bookmarkEnd w:id="0"/>
+    </w:p>
+    <w:p>
+      <w:pPr>
         <w:pStyle w:val="2"/>
         <w:bidi w:val="0"/>
         <w:rPr>
@@ -1047,7 +1363,7 @@
                     </pic:cNvPicPr>
                   </pic:nvPicPr>
                   <pic:blipFill>
-                    <a:blip r:embed="rId18"/>
+                    <a:blip r:embed="rId22"/>
                     <a:stretch>
                       <a:fillRect/>
                     </a:stretch>
@@ -1162,7 +1478,7 @@
                     </pic:cNvPicPr>
                   </pic:nvPicPr>
                   <pic:blipFill>
-                    <a:blip r:embed="rId19"/>
+                    <a:blip r:embed="rId23"/>
                     <a:stretch>
                       <a:fillRect/>
                     </a:stretch>
@@ -1328,7 +1644,7 @@
                     </pic:cNvPicPr>
                   </pic:nvPicPr>
                   <pic:blipFill>
-                    <a:blip r:embed="rId20"/>
+                    <a:blip r:embed="rId24"/>
                     <a:stretch>
                       <a:fillRect/>
                     </a:stretch>
@@ -1431,7 +1747,7 @@
                     </pic:cNvPicPr>
                   </pic:nvPicPr>
                   <pic:blipFill>
-                    <a:blip r:embed="rId21"/>
+                    <a:blip r:embed="rId25"/>
                     <a:stretch>
                       <a:fillRect/>
                     </a:stretch>
@@ -1518,7 +1834,7 @@
                     </pic:cNvPicPr>
                   </pic:nvPicPr>
                   <pic:blipFill>
-                    <a:blip r:embed="rId22"/>
+                    <a:blip r:embed="rId26"/>
                     <a:stretch>
                       <a:fillRect/>
                     </a:stretch>
@@ -1582,6 +1898,7 @@
     <w:p>
       <w:pPr>
         <w:numPr>
+          <w:ilvl w:val="0"/>
           <w:numId w:val="0"/>
         </w:numPr>
         <w:rPr>
@@ -1608,7 +1925,7 @@
                     </pic:cNvPicPr>
                   </pic:nvPicPr>
                   <pic:blipFill>
-                    <a:blip r:embed="rId23"/>
+                    <a:blip r:embed="rId27"/>
                     <a:stretch>
                       <a:fillRect/>
                     </a:stretch>
@@ -1632,8 +1949,6 @@
           </wp:inline>
         </w:drawing>
       </w:r>
-      <w:bookmarkStart w:id="0" w:name="_GoBack"/>
-      <w:bookmarkEnd w:id="0"/>
     </w:p>
     <w:sectPr>
       <w:pgSz w:w="11906" w:h="16838"/>

</xml_diff>